<commit_message>
docs: add double-anonymized Medical Hypotheses package
</commit_message>
<xml_diff>
--- a/submission/medical-hypotheses/package/02_Title_Page.docx
+++ b/submission/medical-hypotheses/package/02_Title_Page.docx
@@ -165,6 +165,26 @@
           <w:color w:val="000000"/>
           <w:sz w:val="20"/>
         </w:rPr>
+        <w:t xml:space="preserve">Peer-review file: </w:t>
+      </w:r>
+      <w:r>
+        <w:rPr>
+          <w:rFonts w:ascii="Times New Roman" w:hAnsi="Times New Roman" w:eastAsia="Times New Roman"/>
+          <w:b w:val="0"/>
+          <w:color w:val="000000"/>
+          <w:sz w:val="20"/>
+        </w:rPr>
+        <w:t>A separate anonymized manuscript with scrubbed Word metadata is supplied for double-anonymized review</w:t>
+      </w:r>
+    </w:p>
+    <w:p>
+      <w:r>
+        <w:rPr>
+          <w:rFonts w:ascii="Times New Roman" w:hAnsi="Times New Roman" w:eastAsia="Times New Roman"/>
+          <w:b/>
+          <w:color w:val="000000"/>
+          <w:sz w:val="20"/>
+        </w:rPr>
         <w:t xml:space="preserve">Manuscript version: </w:t>
       </w:r>
       <w:r>
@@ -174,7 +194,7 @@
           <w:color w:val="000000"/>
           <w:sz w:val="20"/>
         </w:rPr>
-        <w:t>0.3.0</w:t>
+        <w:t>0.3.1</w:t>
       </w:r>
     </w:p>
     <w:p>
@@ -245,7 +265,7 @@
           <w:color w:val="000000"/>
           <w:sz w:val="20"/>
         </w:rPr>
-        <w:t xml:space="preserve">Competing interests: </w:t>
+        <w:t xml:space="preserve">Declaration of interest: </w:t>
       </w:r>
       <w:r>
         <w:rPr>
@@ -254,7 +274,7 @@
           <w:color w:val="000000"/>
           <w:sz w:val="20"/>
         </w:rPr>
-        <w:t>The author declares no competing interests. The author retains copyright in the associated public repository and may consider future commercial-licensing requests. No commercial funding or payment was received for this work.</w:t>
+        <w:t>Declarations of interest: none.</w:t>
       </w:r>
     </w:p>
     <w:p>
@@ -265,7 +285,7 @@
           <w:color w:val="000000"/>
           <w:sz w:val="20"/>
         </w:rPr>
-        <w:t xml:space="preserve">Author contribution: </w:t>
+        <w:t xml:space="preserve">Repository licensing: </w:t>
       </w:r>
       <w:r>
         <w:rPr>
@@ -274,7 +294,47 @@
           <w:color w:val="000000"/>
           <w:sz w:val="20"/>
         </w:rPr>
-        <w:t>Jieyang Chen conceived the hypothesis, performed the literature organization and claim audit, designed the proposed research programme, prepared the figures and reproducibility materials, and drafted and revised the manuscript.</w:t>
+        <w:t>For transparency, the author retains copyright in the associated public repository and may consider future commercial-licensing requests. This is a licensing position rather than a current financial or personal interest; no commercial funding or payment was received for this work.</w:t>
+      </w:r>
+    </w:p>
+    <w:p>
+      <w:r>
+        <w:rPr>
+          <w:rFonts w:ascii="Times New Roman" w:hAnsi="Times New Roman" w:eastAsia="Times New Roman"/>
+          <w:b/>
+          <w:color w:val="000000"/>
+          <w:sz w:val="20"/>
+        </w:rPr>
+        <w:t xml:space="preserve">CRediT author statement: </w:t>
+      </w:r>
+      <w:r>
+        <w:rPr>
+          <w:rFonts w:ascii="Times New Roman" w:hAnsi="Times New Roman" w:eastAsia="Times New Roman"/>
+          <w:b w:val="0"/>
+          <w:color w:val="000000"/>
+          <w:sz w:val="20"/>
+        </w:rPr>
+        <w:t>Jieyang Chen: Conceptualization; Methodology; Investigation; Data curation; Software; Visualization; Writing – original draft; Writing – review &amp; editing; Project administration.</w:t>
+      </w:r>
+    </w:p>
+    <w:p>
+      <w:r>
+        <w:rPr>
+          <w:rFonts w:ascii="Times New Roman" w:hAnsi="Times New Roman" w:eastAsia="Times New Roman"/>
+          <w:b/>
+          <w:color w:val="000000"/>
+          <w:sz w:val="20"/>
+        </w:rPr>
+        <w:t xml:space="preserve">Ethics statement: </w:t>
+      </w:r>
+      <w:r>
+        <w:rPr>
+          <w:rFonts w:ascii="Times New Roman" w:hAnsi="Times New Roman" w:eastAsia="Times New Roman"/>
+          <w:b w:val="0"/>
+          <w:color w:val="000000"/>
+          <w:sz w:val="20"/>
+        </w:rPr>
+        <w:t>Ethics approval and informed consent were not required because this article is a hypothesis and critical review that reports no original research involving human participants, animals, participant-level data, biological material, or identifiable personal information.</w:t>
       </w:r>
     </w:p>
     <w:p>

</xml_diff>